<commit_message>
updated DTR and AR template files, fixed margin issues
</commit_message>
<xml_diff>
--- a/eaas_python/template_files/AR_template.docx
+++ b/eaas_python/template_files/AR_template.docx
@@ -83,7 +83,8 @@
       <w:tblGrid>
         <w:gridCol w:w="3255"/>
         <w:gridCol w:w="1995"/>
-        <w:gridCol w:w="5580"/>
+        <w:gridCol w:w="165"/>
+        <w:gridCol w:w="5415"/>
       </w:tblGrid>
       <w:tr>
         <w:trPr>
@@ -92,7 +93,7 @@
         <w:tc>
           <w:tcPr>
             <w:tcW w:w="10830" w:type="dxa"/>
-            <w:gridSpan w:val="3"/>
+            <w:gridSpan w:val="4"/>
             <w:shd w:val="clear" w:color="auto" w:fill="ADAAAA"/>
           </w:tcPr>
           <w:p>
@@ -131,12 +132,16 @@
       </w:tr>
       <w:tr>
         <w:trPr>
-          <w:trHeight w:val="789"/>
+          <w:trHeight w:val="249"/>
         </w:trPr>
         <w:tc>
           <w:tcPr>
-            <w:tcW w:w="5250" w:type="dxa"/>
-            <w:gridSpan w:val="2"/>
+            <w:tcW w:w="5415" w:type="dxa"/>
+            <w:gridSpan w:val="3"/>
+            <w:tcMar>
+              <w:top w:w="57" w:type="dxa"/>
+              <w:bottom w:w="57" w:type="dxa"/>
+            </w:tcMar>
           </w:tcPr>
           <w:p>
             <w:pPr>
@@ -147,7 +152,7 @@
                 <w:right w:val="nil"/>
                 <w:between w:val="nil"/>
               </w:pBdr>
-              <w:spacing w:before="149"/>
+              <w:spacing w:before="5" w:line="224" w:lineRule="auto"/>
               <w:ind w:left="112"/>
               <w:rPr>
                 <w:rFonts w:ascii="Arial" w:eastAsia="Arial" w:hAnsi="Arial" w:cs="Arial"/>
@@ -179,7 +184,7 @@
                 <w:right w:val="nil"/>
                 <w:between w:val="nil"/>
               </w:pBdr>
-              <w:spacing w:before="11"/>
+              <w:spacing w:before="5" w:line="224" w:lineRule="auto"/>
               <w:ind w:left="112"/>
               <w:rPr>
                 <w:rFonts w:ascii="Arial" w:eastAsia="Arial" w:hAnsi="Arial" w:cs="Arial"/>
@@ -194,7 +199,11 @@
         </w:tc>
         <w:tc>
           <w:tcPr>
-            <w:tcW w:w="5580" w:type="dxa"/>
+            <w:tcW w:w="5415" w:type="dxa"/>
+            <w:tcMar>
+              <w:top w:w="57" w:type="dxa"/>
+              <w:bottom w:w="57" w:type="dxa"/>
+            </w:tcMar>
           </w:tcPr>
           <w:p>
             <w:pPr>
@@ -205,8 +214,8 @@
                 <w:right w:val="nil"/>
                 <w:between w:val="nil"/>
               </w:pBdr>
-              <w:spacing w:before="149"/>
-              <w:ind w:left="100" w:right="4352"/>
+              <w:spacing w:before="5" w:line="224" w:lineRule="auto"/>
+              <w:ind w:left="112"/>
               <w:rPr>
                 <w:rFonts w:ascii="Arial" w:eastAsia="Arial" w:hAnsi="Arial" w:cs="Arial"/>
                 <w:b/>
@@ -237,8 +246,8 @@
                 <w:right w:val="nil"/>
                 <w:between w:val="nil"/>
               </w:pBdr>
-              <w:spacing w:before="11"/>
-              <w:ind w:left="100" w:right="4352"/>
+              <w:spacing w:before="5" w:line="224" w:lineRule="auto"/>
+              <w:ind w:left="112"/>
               <w:rPr>
                 <w:rFonts w:ascii="Arial" w:eastAsia="Arial" w:hAnsi="Arial" w:cs="Arial"/>
                 <w:b/>
@@ -258,7 +267,7 @@
         <w:tc>
           <w:tcPr>
             <w:tcW w:w="10830" w:type="dxa"/>
-            <w:gridSpan w:val="3"/>
+            <w:gridSpan w:val="4"/>
           </w:tcPr>
           <w:p>
             <w:pPr>
@@ -301,7 +310,7 @@
         <w:tc>
           <w:tcPr>
             <w:tcW w:w="10830" w:type="dxa"/>
-            <w:gridSpan w:val="3"/>
+            <w:gridSpan w:val="4"/>
           </w:tcPr>
           <w:p>
             <w:pPr>
@@ -344,7 +353,7 @@
         <w:tc>
           <w:tcPr>
             <w:tcW w:w="10830" w:type="dxa"/>
-            <w:gridSpan w:val="3"/>
+            <w:gridSpan w:val="4"/>
           </w:tcPr>
           <w:p>
             <w:pPr>
@@ -404,7 +413,7 @@
         <w:tc>
           <w:tcPr>
             <w:tcW w:w="7575" w:type="dxa"/>
-            <w:gridSpan w:val="2"/>
+            <w:gridSpan w:val="3"/>
             <w:vAlign w:val="center"/>
           </w:tcPr>
           <w:p>
@@ -461,6 +470,7 @@
         <w:tc>
           <w:tcPr>
             <w:tcW w:w="5580" w:type="dxa"/>
+            <w:gridSpan w:val="2"/>
           </w:tcPr>
           <w:p>
             <w:pPr>
@@ -533,6 +543,7 @@
         <w:tc>
           <w:tcPr>
             <w:tcW w:w="5580" w:type="dxa"/>
+            <w:gridSpan w:val="2"/>
           </w:tcPr>
           <w:p>
             <w:pPr>

</xml_diff>